<commit_message>
Add name, registration number and section to the documentation
</commit_message>
<xml_diff>
--- a/docs/Campus-Event-Hub-Documentation.docx
+++ b/docs/Campus-Event-Hub-Documentation.docx
@@ -49,7 +49,7 @@
       <w:tr>
         <w:trPr>
           <w:cantSplit/>
-          <w:tblHeader/>
+          <w:tblHeader w:val="off"/>
         </w:trPr>
         <w:tc>
           <w:tcPr>
@@ -60,7 +60,6 @@
               <w:bottom w:val="single" w:color="CBD5E1" w:sz="4"/>
               <w:right w:val="single" w:color="CBD5E1" w:sz="4"/>
             </w:tcBorders>
-            <w:shd w:fill="E0E7FF" w:color="auto" w:val="clear"/>
             <w:tcMar>
               <w:top w:type="dxa" w:w="50"/>
               <w:left w:type="dxa" w:w="100"/>
@@ -80,7 +79,7 @@
                 <w:sz w:val="18"/>
                 <w:szCs w:val="18"/>
               </w:rPr>
-              <w:t xml:space="preserve">Student</w:t>
+              <w:t xml:space="preserve">Name</w:t>
             </w:r>
           </w:p>
         </w:tc>
@@ -93,27 +92,26 @@
               <w:bottom w:val="single" w:color="CBD5E1" w:sz="4"/>
               <w:right w:val="single" w:color="CBD5E1" w:sz="4"/>
             </w:tcBorders>
-            <w:shd w:fill="E0E7FF" w:color="auto" w:val="clear"/>
-            <w:tcMar>
-              <w:top w:type="dxa" w:w="50"/>
-              <w:left w:type="dxa" w:w="100"/>
-              <w:bottom w:type="dxa" w:w="50"/>
-              <w:right w:type="dxa" w:w="100"/>
-            </w:tcMar>
-          </w:tcPr>
-          <w:p>
-            <w:pPr>
-              <w:keepNext w:val="false"/>
-              <w:spacing w:after="0" w:line="245"/>
-            </w:pPr>
-            <w:r>
-              <w:rPr>
-                <w:b/>
-                <w:bCs/>
-                <w:sz w:val="18"/>
-                <w:szCs w:val="18"/>
-              </w:rPr>
-              <w:t xml:space="preserve">Sahil, B.Tech AIML, V Semester, Manipal University Jaipur</w:t>
+            <w:tcMar>
+              <w:top w:type="dxa" w:w="50"/>
+              <w:left w:type="dxa" w:w="100"/>
+              <w:bottom w:type="dxa" w:w="50"/>
+              <w:right w:type="dxa" w:w="100"/>
+            </w:tcMar>
+          </w:tcPr>
+          <w:p>
+            <w:pPr>
+              <w:keepNext w:val="false"/>
+              <w:spacing w:after="0" w:line="245"/>
+            </w:pPr>
+            <w:r>
+              <w:rPr>
+                <w:b w:val="false"/>
+                <w:bCs w:val="false"/>
+                <w:sz w:val="18"/>
+                <w:szCs w:val="18"/>
+              </w:rPr>
+              <w:t xml:space="preserve">Sahil Lenka</w:t>
             </w:r>
           </w:p>
         </w:tc>
@@ -146,12 +144,12 @@
             </w:pPr>
             <w:r>
               <w:rPr>
-                <w:b w:val="false"/>
-                <w:bCs w:val="false"/>
-                <w:sz w:val="18"/>
-                <w:szCs w:val="18"/>
-              </w:rPr>
-              <w:t xml:space="preserve">Course</w:t>
+                <w:b/>
+                <w:bCs/>
+                <w:sz w:val="18"/>
+                <w:szCs w:val="18"/>
+              </w:rPr>
+              <w:t xml:space="preserve">Registration no.</w:t>
             </w:r>
           </w:p>
         </w:tc>
@@ -183,7 +181,7 @@
                 <w:sz w:val="18"/>
                 <w:szCs w:val="18"/>
               </w:rPr>
-              <w:t xml:space="preserve">AIM3140 Web Technologies (project component: backend and frontend)</w:t>
+              <w:t xml:space="preserve">2427010391</w:t>
             </w:r>
           </w:p>
         </w:tc>
@@ -216,12 +214,12 @@
             </w:pPr>
             <w:r>
               <w:rPr>
-                <w:b w:val="false"/>
-                <w:bCs w:val="false"/>
-                <w:sz w:val="18"/>
-                <w:szCs w:val="18"/>
-              </w:rPr>
-              <w:t xml:space="preserve">Live site</w:t>
+                <w:b/>
+                <w:bCs/>
+                <w:sz w:val="18"/>
+                <w:szCs w:val="18"/>
+              </w:rPr>
+              <w:t xml:space="preserve">Programme</w:t>
             </w:r>
           </w:p>
         </w:tc>
@@ -253,7 +251,7 @@
                 <w:sz w:val="18"/>
                 <w:szCs w:val="18"/>
               </w:rPr>
-              <w:t xml:space="preserve">https://campus-event-hub-lake.vercel.app</w:t>
+              <w:t xml:space="preserve">B.Tech AIML, Section C, V Semester, Manipal University Jaipur</w:t>
             </w:r>
           </w:p>
         </w:tc>
@@ -286,8 +284,148 @@
             </w:pPr>
             <w:r>
               <w:rPr>
-                <w:b w:val="false"/>
-                <w:bCs w:val="false"/>
+                <w:b/>
+                <w:bCs/>
+                <w:sz w:val="18"/>
+                <w:szCs w:val="18"/>
+              </w:rPr>
+              <w:t xml:space="preserve">Course</w:t>
+            </w:r>
+          </w:p>
+        </w:tc>
+        <w:tc>
+          <w:tcPr>
+            <w:tcW w:type="dxa" w:w="7746"/>
+            <w:tcBorders>
+              <w:top w:val="single" w:color="CBD5E1" w:sz="4"/>
+              <w:left w:val="single" w:color="CBD5E1" w:sz="4"/>
+              <w:bottom w:val="single" w:color="CBD5E1" w:sz="4"/>
+              <w:right w:val="single" w:color="CBD5E1" w:sz="4"/>
+            </w:tcBorders>
+            <w:tcMar>
+              <w:top w:type="dxa" w:w="50"/>
+              <w:left w:type="dxa" w:w="100"/>
+              <w:bottom w:type="dxa" w:w="50"/>
+              <w:right w:type="dxa" w:w="100"/>
+            </w:tcMar>
+          </w:tcPr>
+          <w:p>
+            <w:pPr>
+              <w:keepNext w:val="false"/>
+              <w:spacing w:after="0" w:line="245"/>
+            </w:pPr>
+            <w:r>
+              <w:rPr>
+                <w:b w:val="false"/>
+                <w:bCs w:val="false"/>
+                <w:sz w:val="18"/>
+                <w:szCs w:val="18"/>
+              </w:rPr>
+              <w:t xml:space="preserve">AIM3140 Web Technologies (project component: backend and frontend)</w:t>
+            </w:r>
+          </w:p>
+        </w:tc>
+      </w:tr>
+      <w:tr>
+        <w:trPr>
+          <w:cantSplit/>
+          <w:tblHeader w:val="off"/>
+        </w:trPr>
+        <w:tc>
+          <w:tcPr>
+            <w:tcW w:type="dxa" w:w="2000"/>
+            <w:tcBorders>
+              <w:top w:val="single" w:color="CBD5E1" w:sz="4"/>
+              <w:left w:val="single" w:color="CBD5E1" w:sz="4"/>
+              <w:bottom w:val="single" w:color="CBD5E1" w:sz="4"/>
+              <w:right w:val="single" w:color="CBD5E1" w:sz="4"/>
+            </w:tcBorders>
+            <w:tcMar>
+              <w:top w:type="dxa" w:w="50"/>
+              <w:left w:type="dxa" w:w="100"/>
+              <w:bottom w:type="dxa" w:w="50"/>
+              <w:right w:type="dxa" w:w="100"/>
+            </w:tcMar>
+          </w:tcPr>
+          <w:p>
+            <w:pPr>
+              <w:keepNext w:val="false"/>
+              <w:spacing w:after="0" w:line="245"/>
+            </w:pPr>
+            <w:r>
+              <w:rPr>
+                <w:b/>
+                <w:bCs/>
+                <w:sz w:val="18"/>
+                <w:szCs w:val="18"/>
+              </w:rPr>
+              <w:t xml:space="preserve">Live site</w:t>
+            </w:r>
+          </w:p>
+        </w:tc>
+        <w:tc>
+          <w:tcPr>
+            <w:tcW w:type="dxa" w:w="7746"/>
+            <w:tcBorders>
+              <w:top w:val="single" w:color="CBD5E1" w:sz="4"/>
+              <w:left w:val="single" w:color="CBD5E1" w:sz="4"/>
+              <w:bottom w:val="single" w:color="CBD5E1" w:sz="4"/>
+              <w:right w:val="single" w:color="CBD5E1" w:sz="4"/>
+            </w:tcBorders>
+            <w:tcMar>
+              <w:top w:type="dxa" w:w="50"/>
+              <w:left w:type="dxa" w:w="100"/>
+              <w:bottom w:type="dxa" w:w="50"/>
+              <w:right w:type="dxa" w:w="100"/>
+            </w:tcMar>
+          </w:tcPr>
+          <w:p>
+            <w:pPr>
+              <w:keepNext w:val="false"/>
+              <w:spacing w:after="0" w:line="245"/>
+            </w:pPr>
+            <w:r>
+              <w:rPr>
+                <w:b w:val="false"/>
+                <w:bCs w:val="false"/>
+                <w:sz w:val="18"/>
+                <w:szCs w:val="18"/>
+              </w:rPr>
+              <w:t xml:space="preserve">https://campus-event-hub-lake.vercel.app</w:t>
+            </w:r>
+          </w:p>
+        </w:tc>
+      </w:tr>
+      <w:tr>
+        <w:trPr>
+          <w:cantSplit/>
+          <w:tblHeader w:val="off"/>
+        </w:trPr>
+        <w:tc>
+          <w:tcPr>
+            <w:tcW w:type="dxa" w:w="2000"/>
+            <w:tcBorders>
+              <w:top w:val="single" w:color="CBD5E1" w:sz="4"/>
+              <w:left w:val="single" w:color="CBD5E1" w:sz="4"/>
+              <w:bottom w:val="single" w:color="CBD5E1" w:sz="4"/>
+              <w:right w:val="single" w:color="CBD5E1" w:sz="4"/>
+            </w:tcBorders>
+            <w:tcMar>
+              <w:top w:type="dxa" w:w="50"/>
+              <w:left w:type="dxa" w:w="100"/>
+              <w:bottom w:type="dxa" w:w="50"/>
+              <w:right w:type="dxa" w:w="100"/>
+            </w:tcMar>
+          </w:tcPr>
+          <w:p>
+            <w:pPr>
+              <w:keepNext w:val="false"/>
+              <w:spacing w:after="0" w:line="245"/>
+            </w:pPr>
+            <w:r>
+              <w:rPr>
+                <w:b/>
+                <w:bCs/>
                 <w:sz w:val="18"/>
                 <w:szCs w:val="18"/>
               </w:rPr>

</xml_diff>

<commit_message>
Add notifications: in-app bell and page, optional email, cancel alerts
</commit_message>
<xml_diff>
--- a/docs/Campus-Event-Hub-Documentation.docx
+++ b/docs/Campus-Event-Hub-Documentation.docx
@@ -670,7 +670,7 @@
                 <w:sz w:val="18"/>
                 <w:szCs w:val="18"/>
               </w:rPr>
-              <w:t xml:space="preserve">Browse upcoming events with a seat meter. Live search without reloading the page. Filter by category and by time (today, this week, later), show only events with free seats, and sort by soonest or most popular. Register or cancel in one click. Join the waitlist when an event is full and see your position. Save events with a heart button, and download an .ics file to add an event to a calendar. A “My events” page lists events you are going to, your waitlist positions and events you host. Dark and light themes.</w:t>
+              <w:t xml:space="preserve">Browse upcoming events with a seat meter. Live search without reloading the page. Filter by category and by time (today, this week, later), show only events with free seats, and sort by soonest or most popular. Register or cancel in one click. Join the waitlist when an event is full and see your position. Save events with a heart button, and download an .ics file to add an event to a calendar. A “My events” page lists events you are going to, your waitlist positions and events you host. A notification bell tells you when a waitlist seat opens up for you or an event you joined is cancelled (and emails you if you gave an address and mail is set up). Dark and light themes.</w:t>
             </w:r>
           </w:p>
         </w:tc>
@@ -1452,7 +1452,7 @@
         <w:spacing w:after="90" w:line="264"/>
       </w:pPr>
       <w:r>
-        <w:t xml:space="preserve">The app follows Django’s Model-View-Template pattern: URLs are routed to views, views read and write models through the ORM, and templates build the HTML. Pages work without JavaScript for browsing; jQuery adds the live behaviour. The database has four tables of its own, plus Django’s built-in user table.</w:t>
+        <w:t xml:space="preserve">The app follows Django’s Model-View-Template pattern: URLs are routed to views, views read and write models through the ORM, and templates build the HTML. Pages work without JavaScript for browsing; jQuery adds the live behaviour. The database has five tables of its own, plus Django’s built-in user table.</w:t>
       </w:r>
     </w:p>
     <w:tbl>
@@ -1776,7 +1776,7 @@
           </w:tcPr>
           <w:p>
             <w:pPr>
-              <w:keepNext w:val="false"/>
+              <w:keepNext/>
               <w:spacing w:after="0" w:line="245"/>
             </w:pPr>
             <w:r>
@@ -1808,7 +1808,7 @@
           </w:tcPr>
           <w:p>
             <w:pPr>
-              <w:keepNext w:val="false"/>
+              <w:keepNext/>
               <w:spacing w:after="0" w:line="245"/>
             </w:pPr>
             <w:r>
@@ -1819,6 +1819,76 @@
                 <w:szCs w:val="18"/>
               </w:rPr>
               <w:t xml:space="preserve">user and event the user saved; unique per pair.</w:t>
+            </w:r>
+          </w:p>
+        </w:tc>
+      </w:tr>
+      <w:tr>
+        <w:trPr>
+          <w:cantSplit/>
+          <w:tblHeader w:val="off"/>
+        </w:trPr>
+        <w:tc>
+          <w:tcPr>
+            <w:tcW w:type="dxa" w:w="1700"/>
+            <w:tcBorders>
+              <w:top w:val="single" w:color="CBD5E1" w:sz="4"/>
+              <w:left w:val="single" w:color="CBD5E1" w:sz="4"/>
+              <w:bottom w:val="single" w:color="CBD5E1" w:sz="4"/>
+              <w:right w:val="single" w:color="CBD5E1" w:sz="4"/>
+            </w:tcBorders>
+            <w:tcMar>
+              <w:top w:type="dxa" w:w="50"/>
+              <w:left w:type="dxa" w:w="100"/>
+              <w:bottom w:type="dxa" w:w="50"/>
+              <w:right w:type="dxa" w:w="100"/>
+            </w:tcMar>
+          </w:tcPr>
+          <w:p>
+            <w:pPr>
+              <w:keepNext w:val="false"/>
+              <w:spacing w:after="0" w:line="245"/>
+            </w:pPr>
+            <w:r>
+              <w:rPr>
+                <w:b w:val="false"/>
+                <w:bCs w:val="false"/>
+                <w:sz w:val="18"/>
+                <w:szCs w:val="18"/>
+              </w:rPr>
+              <w:t xml:space="preserve">Notification</w:t>
+            </w:r>
+          </w:p>
+        </w:tc>
+        <w:tc>
+          <w:tcPr>
+            <w:tcW w:type="dxa" w:w="8046"/>
+            <w:tcBorders>
+              <w:top w:val="single" w:color="CBD5E1" w:sz="4"/>
+              <w:left w:val="single" w:color="CBD5E1" w:sz="4"/>
+              <w:bottom w:val="single" w:color="CBD5E1" w:sz="4"/>
+              <w:right w:val="single" w:color="CBD5E1" w:sz="4"/>
+            </w:tcBorders>
+            <w:tcMar>
+              <w:top w:type="dxa" w:w="50"/>
+              <w:left w:type="dxa" w:w="100"/>
+              <w:bottom w:type="dxa" w:w="50"/>
+              <w:right w:type="dxa" w:w="100"/>
+            </w:tcMar>
+          </w:tcPr>
+          <w:p>
+            <w:pPr>
+              <w:keepNext w:val="false"/>
+              <w:spacing w:after="0" w:line="245"/>
+            </w:pPr>
+            <w:r>
+              <w:rPr>
+                <w:b w:val="false"/>
+                <w:bCs w:val="false"/>
+                <w:sz w:val="18"/>
+                <w:szCs w:val="18"/>
+              </w:rPr>
+              <w:t xml:space="preserve">user, message, link, created time and read time; created when a waitlist seat opens up or an event is cancelled.</w:t>
             </w:r>
           </w:p>
         </w:tc>
@@ -1919,6 +1989,26 @@
       </w:r>
       <w:r>
         <w:t xml:space="preserve"> Only the event’s creator can open the attendee page, toggle check-in or download the CSV; anyone else gets a 403 error. In the CSV, names starting with = + - or @ are prefixed so a spreadsheet cannot run them as a formula.</w:t>
+      </w:r>
+    </w:p>
+    <w:p>
+      <w:pPr>
+        <w:pStyle w:val="ListParagraph"/>
+        <w:numPr>
+          <w:ilvl w:val="0"/>
+          <w:numId w:val="2"/>
+        </w:numPr>
+        <w:spacing w:after="50" w:line="260"/>
+      </w:pPr>
+      <w:r>
+        <w:rPr>
+          <w:b/>
+          <w:bCs/>
+        </w:rPr>
+        <w:t xml:space="preserve">Notifications.</w:t>
+      </w:r>
+      <w:r>
+        <w:t xml:space="preserve"> When a seat opens up for someone on the waitlist, or the host deletes an event, the affected people get a notification. The bell in the menu shows the unread count and the notifications page marks them read. If mail settings exist, the same message is also emailed, and a failing mail server never blocks a registration.</w:t>
       </w:r>
     </w:p>
     <w:p>
@@ -2384,10 +2474,10 @@
           <w:b/>
           <w:bCs/>
         </w:rPr>
-        <w:t xml:space="preserve">70 automated tests</w:t>
-      </w:r>
-      <w:r>
-        <w:t xml:space="preserve"> (python manage.py test) cover registration and waitlist rules, filters and paging, saved events, the calendar file, the host dashboard, CSV escaping, permissions, forms and the login and signup pages. They run on an in-memory SQLite database.</w:t>
+        <w:t xml:space="preserve">82 automated tests</w:t>
+      </w:r>
+      <w:r>
+        <w:t xml:space="preserve"> (python manage.py test) cover registration and waitlist rules, notifications and email, filters and paging, saved events, the calendar file, the host dashboard, CSV escaping, permissions, forms and the login and signup pages. They run on an in-memory SQLite database.</w:t>
       </w:r>
     </w:p>
     <w:p>
@@ -2509,7 +2599,7 @@
         <w:spacing w:after="50" w:line="260"/>
       </w:pPr>
       <w:r>
-        <w:t xml:space="preserve">No email or SMS messages, so a waitlist promotion shows on the site only. Notifications would be the next feature.</w:t>
+        <w:t xml:space="preserve">No SMS, because it needs a paid provider. Emails are sent only when the site has mail settings and the person gave an address at sign up. The live site has no mail settings yet, so there the alerts show in the notification bell.</w:t>
       </w:r>
     </w:p>
     <w:p>

</xml_diff>